<commit_message>
Spec: phone app as built (in-app camera, tabs on the main screen, POI screen layout, group clearing, service auto-resume)
Co-Authored-By: Claude Fable 5.1 <noreply@anthropic.com>
</commit_message>
<xml_diff>
--- a/docs/Trip_Explorer_Spec.docx
+++ b/docs/Trip_Explorer_Spec.docx
@@ -18,7 +18,7 @@
         <w:rPr>
           <w:color w:val="666666"/>
         </w:rPr>
-        <w:t>Sep 21, 2026 · @Someone · updated Sep 23, 2026</w:t>
+        <w:t>Sep 21, 2026 · @Someone · updated Sep 23, 2026 (phone app as built)</w:t>
       </w:r>
     </w:p>
     <w:p>
@@ -2475,7 +2475,7 @@
         <w:t>&lt;current trip&gt;/recordings/</w:t>
       </w:r>
       <w:r>
-        <w:t>.</w:t>
+        <w:t>. If Android kills and restarts the service, it continues into the same file by itself, as a new segment.</w:t>
       </w:r>
     </w:p>
     <w:p>
@@ -2682,7 +2682,7 @@
         <w:spacing w:after="60"/>
       </w:pPr>
       <w:r>
-        <w:t>Opens the phone’s own camera app at once (system camera intent, not an in-app camera). After each photo the app offers “Another photo” or “Done”; a Skip button for no photo.</w:t>
+        <w:t>Opens the app’s own camera at once (CameraX, not the system camera app): a shutter, a switch-camera button and Done. Photos are taken one after the other, each shown as a thumbnail; Done closes the camera and shows them in the POI’s media pager. With no photo taken the button reads Skip; the Back gesture also closes the camera.</w:t>
       </w:r>
     </w:p>
     <w:p>
@@ -2729,20 +2729,20 @@
         <w:spacing w:after="60"/>
       </w:pPr>
       <w:r>
-        <w:t>Browse all trips, following the folders.</w:t>
-      </w:r>
-    </w:p>
-    <w:p>
-      <w:pPr>
-        <w:pStyle w:val="ListParagraph"/>
-        <w:numPr>
-          <w:ilvl w:val="0"/>
-          <w:numId w:val="2"/>
-        </w:numPr>
-        <w:spacing w:after="60"/>
-      </w:pPr>
-      <w:r>
-        <w:t>Open a POI to edit name, description and group, or add media. Renaming renames the folder (name rules apply). Changing the group renames the group file (e.g. group-water.txt → group-caves.txt), so nothing is deleted.</w:t>
+        <w:t>The main screen holds, top to bottom: the trip dropdown; two tabs, POIs and Recordings, filling most of the screen and following the current trip’s folders; Add POI; and the recording controls (Start, or elapsed time with Pause/Resume and Stop, in the same height). Another trip’s POIs are seen by picking it in the dropdown.</w:t>
+      </w:r>
+    </w:p>
+    <w:p>
+      <w:pPr>
+        <w:pStyle w:val="ListParagraph"/>
+        <w:numPr>
+          <w:ilvl w:val="0"/>
+          <w:numId w:val="2"/>
+        </w:numPr>
+        <w:spacing w:after="60"/>
+      </w:pPr>
+      <w:r>
+        <w:t>Open a POI to edit name, description and group, or add media. The POI screen shows a large swipeable media pager on top (tap opens the full-screen preview), the fields below, and Add photo / Record note at the bottom; Save appears only when something changed; there is no Back button (the Back gesture is used). Renaming renames the folder (name rules apply). Changing the group renames the group file (e.g. group-water.txt → group-caves.txt), so nothing is deleted; clearing the group renames it to a hidden .group-&lt;name&gt;.txt, which both apps read as No group.</w:t>
       </w:r>
     </w:p>
     <w:p>
@@ -2810,7 +2810,7 @@
         <w:t>Copy as-is:</w:t>
       </w:r>
       <w:r>
-        <w:t xml:space="preserve"> theme (colors, fonts), recording service basics (foreground service, notification, location setup, periodic saving; without the processing), incomplete-recording dialog, storage permission screen, media preview.</w:t>
+        <w:t xml:space="preserve"> theme (colors, fonts), recording service basics (foreground service, notification, location setup, periodic saving; without the processing), storage permission screen, media preview, battery-optimization prompt before the first recording.</w:t>
       </w:r>
     </w:p>
     <w:p>
@@ -2830,7 +2830,7 @@
         <w:t>Rebuild, same look:</w:t>
       </w:r>
       <w:r>
-        <w:t xml:space="preserve"> POI screen and POI list, keeping most of the current controls with simpler code underneath.</w:t>
+        <w:t xml:space="preserve"> POI screen and POI list, incomplete-recording dialog, keeping most of the current controls with simpler code underneath. New: the in-app camera.</w:t>
       </w:r>
     </w:p>
     <w:p>

</xml_diff>

<commit_message>
Spec: search and plan (PC search/plan window, plans/ folder, Plans tab on the phone)
Co-Authored-By: Claude Fable 5.1 <noreply@anthropic.com>
</commit_message>
<xml_diff>
--- a/docs/Trip_Explorer_Spec.docx
+++ b/docs/Trip_Explorer_Spec.docx
@@ -51,10 +51,10 @@
           <w:b/>
           <w:bCs/>
         </w:rPr>
-        <w:t>Organic, not planned:</w:t>
-      </w:r>
-      <w:r>
-        <w:t xml:space="preserve"> no trip planning.</w:t>
+        <w:t>Files are the truth:</w:t>
+      </w:r>
+      <w:r>
+        <w:t xml:space="preserve"> plain folders and text files, readable without any app. Moving a folder changes its meaning.</w:t>
       </w:r>
     </w:p>
     <w:p>
@@ -71,10 +71,10 @@
           <w:b/>
           <w:bCs/>
         </w:rPr>
-        <w:t>Files are the truth:</w:t>
-      </w:r>
-      <w:r>
-        <w:t xml:space="preserve"> plain folders and text files, readable without any app. Moving a folder changes its meaning.</w:t>
+        <w:t>Open source and community-based only:</w:t>
+      </w:r>
+      <w:r>
+        <w:t xml:space="preserve"> no Google Maps, no MapTiler. (Web searches for a place use Google, shown inside the app; see Embedded browser.)</w:t>
       </w:r>
     </w:p>
     <w:p>
@@ -91,10 +91,10 @@
           <w:b/>
           <w:bCs/>
         </w:rPr>
-        <w:t>Open source and community-based only:</w:t>
-      </w:r>
-      <w:r>
-        <w:t xml:space="preserve"> no Google Maps, no MapTiler. (Web searches for a place use Google, shown inside the app; see Embedded browser.)</w:t>
+        <w:t>Two apps, plus the normal file manager:</w:t>
+      </w:r>
+      <w:r>
+        <w:t xml:space="preserve"> the phone app writes the folders, the PC app shows them on a map and writes plans (see Search and plan). Browsing, searching and editing files is done in the operating system’s own file manager; nothing is built for it. No shared code between the apps.</w:t>
       </w:r>
     </w:p>
     <w:p>
@@ -111,10 +111,10 @@
           <w:b/>
           <w:bCs/>
         </w:rPr>
-        <w:t>Two apps, plus the normal file manager:</w:t>
-      </w:r>
-      <w:r>
-        <w:t xml:space="preserve"> the phone app writes the folders, the PC app shows them on a map. Browsing, searching and editing files is done in the operating system’s own file manager; nothing is built for it. No shared code between the apps.</w:t>
+        <w:t>Neither app ever deletes anything.</w:t>
+      </w:r>
+      <w:r>
+        <w:t xml:space="preserve"> Deleting is done only in the file manager.</w:t>
       </w:r>
     </w:p>
     <w:p>
@@ -131,26 +131,6 @@
           <w:b/>
           <w:bCs/>
         </w:rPr>
-        <w:t>Neither app ever deletes anything.</w:t>
-      </w:r>
-      <w:r>
-        <w:t xml:space="preserve"> Deleting is done only in the file manager.</w:t>
-      </w:r>
-    </w:p>
-    <w:p>
-      <w:pPr>
-        <w:pStyle w:val="ListParagraph"/>
-        <w:numPr>
-          <w:ilvl w:val="0"/>
-          <w:numId w:val="2"/>
-        </w:numPr>
-        <w:spacing w:after="60"/>
-      </w:pPr>
-      <w:r>
-        <w:rPr>
-          <w:b/>
-          <w:bCs/>
-        </w:rPr>
         <w:t>A new build, not a trim:</w:t>
       </w:r>
       <w:r>
@@ -188,7 +168,7 @@
         <w:t>recordings/</w:t>
       </w:r>
       <w:r>
-        <w:t xml:space="preserve"> folder plus one folder per POI.</w:t>
+        <w:t xml:space="preserve"> folder plus one folder per POI. Plans sit in a plans/ folder inside trips/, beside the trips.</w:t>
       </w:r>
     </w:p>
     <w:p>
@@ -202,6 +182,32 @@
           <w:szCs w:val="19"/>
         </w:rPr>
         <w:t>trips/</w:t>
+      </w:r>
+    </w:p>
+    <w:p>
+      <w:pPr>
+        <w:shd w:val="clear" w:color="auto" w:fill="F2F2F2"/>
+      </w:pPr>
+      <w:r>
+        <w:rPr>
+          <w:rFonts w:ascii="Consolas" w:eastAsia="Consolas" w:hAnsi="Consolas" w:cs="Consolas"/>
+          <w:sz w:val="19"/>
+          <w:szCs w:val="19"/>
+        </w:rPr>
+        <w:t xml:space="preserve">├── plans/</w:t>
+      </w:r>
+    </w:p>
+    <w:p>
+      <w:pPr>
+        <w:shd w:val="clear" w:color="auto" w:fill="F2F2F2"/>
+      </w:pPr>
+      <w:r>
+        <w:rPr>
+          <w:rFonts w:ascii="Consolas" w:eastAsia="Consolas" w:hAnsi="Consolas" w:cs="Consolas"/>
+          <w:sz w:val="19"/>
+          <w:szCs w:val="19"/>
+        </w:rPr>
+        <w:t xml:space="preserve">│   └── &lt;plan name&gt;.txt</w:t>
       </w:r>
     </w:p>
     <w:p>
@@ -869,6 +875,46 @@
     </w:p>
     <w:p>
       <w:pPr>
+        <w:pStyle w:val="ListParagraph"/>
+        <w:numPr>
+          <w:ilvl w:val="0"/>
+          <w:numId w:val="2"/>
+        </w:numPr>
+        <w:spacing w:after="60"/>
+      </w:pPr>
+      <w:r>
+        <w:rPr>
+          <w:b/>
+          <w:bCs/>
+        </w:rPr>
+        <w:t xml:space="preserve">plans/:</w:t>
+      </w:r>
+      <w:r>
+        <w:t xml:space="preserve"> the plans/ folder holds only plan files. It is not a trip: the trip dropdown and the folder tree skip it.</w:t>
+      </w:r>
+    </w:p>
+    <w:p>
+      <w:pPr>
+        <w:pStyle w:val="ListParagraph"/>
+        <w:numPr>
+          <w:ilvl w:val="0"/>
+          <w:numId w:val="2"/>
+        </w:numPr>
+        <w:spacing w:after="60"/>
+      </w:pPr>
+      <w:r>
+        <w:rPr>
+          <w:b/>
+          <w:bCs/>
+        </w:rPr>
+        <w:t xml:space="preserve">Plan file:</w:t>
+      </w:r>
+      <w:r>
+        <w:t xml:space="preserve"> one stop per line, in plan order: lat, lon, name, e.g. 45.46420, 9.19000, Castello Sforzesco.</w:t>
+      </w:r>
+    </w:p>
+    <w:p>
+      <w:pPr>
         <w:pStyle w:val="Heading2"/>
       </w:pPr>
       <w:r>
@@ -948,6 +994,32 @@
       </w:pPr>
       <w:r>
         <w:t>Not “recordings”: that name is reserved for the recordings folder, so a POI can’t use it.</w:t>
+      </w:r>
+    </w:p>
+    <w:p>
+      <w:pPr>
+        <w:pStyle w:val="ListParagraph"/>
+        <w:numPr>
+          <w:ilvl w:val="0"/>
+          <w:numId w:val="2"/>
+        </w:numPr>
+        <w:spacing w:after="60"/>
+      </w:pPr>
+      <w:r>
+        <w:t xml:space="preserve">Not “plans” for a trip: that name is reserved for the plans folder.</w:t>
+      </w:r>
+    </w:p>
+    <w:p>
+      <w:pPr>
+        <w:pStyle w:val="ListParagraph"/>
+        <w:numPr>
+          <w:ilvl w:val="0"/>
+          <w:numId w:val="2"/>
+        </w:numPr>
+        <w:spacing w:after="60"/>
+      </w:pPr>
+      <w:r>
+        <w:t xml:space="preserve">Plan names follow the same rules; a plan name already used is refused.</w:t>
       </w:r>
     </w:p>
     <w:p>
@@ -2432,7 +2504,7 @@
         <w:spacing w:after="60"/>
       </w:pPr>
       <w:r>
-        <w:t>A dropdown picks the current trip. “New trip” creates a folder.</w:t>
+        <w:t>A dropdown picks the current trip (plans/ is not listed). “New trip” creates a folder.</w:t>
       </w:r>
     </w:p>
     <w:p>
@@ -2729,7 +2801,7 @@
         <w:spacing w:after="60"/>
       </w:pPr>
       <w:r>
-        <w:t>The main screen holds, top to bottom: the trip dropdown; two tabs, POIs and Recordings, filling most of the screen and following the current trip’s folders; Add POI; and the recording controls (Start, or elapsed time with Pause/Resume and Stop, in the same height). Another trip’s POIs are seen by picking it in the dropdown.</w:t>
+        <w:t>The main screen holds, top to bottom: the trip dropdown; three tabs, POIs, Recordings and Plans, filling most of the screen (POIs and Recordings follow the current trip’s folders; Plans shows all plans); Add POI; and the recording controls (Start, or elapsed time with Pause/Resume and Stop, in the same height). Another trip’s POIs are seen by picking it in the dropdown.</w:t>
       </w:r>
     </w:p>
     <w:p>
@@ -2756,6 +2828,60 @@
       </w:pPr>
       <w:r>
         <w:t>“Show in map” opens an external map app (e.g. Organic Maps or OsmAnd) at the POI with a pin, using a standard geo: link with the coordinates and the POI name as label: geo:lat,lon?q=lat,lon(POI name). If no map app is installed, a message says so.</w:t>
+      </w:r>
+    </w:p>
+    <w:p>
+      <w:pPr>
+        <w:pStyle w:val="Heading2"/>
+      </w:pPr>
+      <w:r>
+        <w:t xml:space="preserve">Plans</w:t>
+      </w:r>
+    </w:p>
+    <w:p>
+      <w:pPr>
+        <w:pStyle w:val="ListParagraph"/>
+        <w:numPr>
+          <w:ilvl w:val="0"/>
+          <w:numId w:val="2"/>
+        </w:numPr>
+        <w:spacing w:after="60"/>
+      </w:pPr>
+      <w:r>
+        <w:t xml:space="preserve">The Plans tab, to the right of Recordings, lists every file in trips/plans/, whatever trip is picked. The phone only reads plans; they are made on the PC.</w:t>
+      </w:r>
+    </w:p>
+    <w:p>
+      <w:pPr>
+        <w:pStyle w:val="ListParagraph"/>
+        <w:numPr>
+          <w:ilvl w:val="0"/>
+          <w:numId w:val="2"/>
+        </w:numPr>
+        <w:spacing w:after="60"/>
+      </w:pPr>
+      <w:r>
+        <w:t xml:space="preserve">Tapping a plan shows its stops, numbered, in the saved order.</w:t>
+      </w:r>
+    </w:p>
+    <w:p>
+      <w:pPr>
+        <w:pStyle w:val="ListParagraph"/>
+        <w:numPr>
+          <w:ilvl w:val="0"/>
+          <w:numId w:val="2"/>
+        </w:numPr>
+        <w:spacing w:after="60"/>
+      </w:pPr>
+      <w:r>
+        <w:rPr>
+          <w:b/>
+          <w:bCs/>
+        </w:rPr>
+        <w:t xml:space="preserve">Load into Waze:</w:t>
+      </w:r>
+      <w:r>
+        <w:t xml:space="preserve"> tapping a stop opens Waze navigating to it: https://waze.com/ul?ll=lat,lon&amp;navigate=yes. A Waze link holds one destination only, so a plan is driven one stop at a time: back in the app, the next stop (after the last one opened) is highlighted. If Waze is not installed, a message says so.</w:t>
       </w:r>
     </w:p>
     <w:p>
@@ -2850,7 +2976,7 @@
         <w:t>Leave behind:</w:t>
       </w:r>
       <w:r>
-        <w:t xml:space="preserve"> map, markers, search &amp; plan, star, group editing, icon and color pickers, import/export, route detail screens, OSM POIs, processing pipeline.</w:t>
+        <w:t xml:space="preserve"> map, markers, the old search &amp; plan (plans are new, see Plans), star, group editing, icon and color pickers, import/export, route detail screens, OSM POIs, processing pipeline.</w:t>
       </w:r>
     </w:p>
     <w:p>
@@ -3436,6 +3562,19 @@
         <w:spacing w:after="60"/>
       </w:pPr>
       <w:r>
+        <w:t xml:space="preserve">The plans/ folder is not shown in the tree.</w:t>
+      </w:r>
+    </w:p>
+    <w:p>
+      <w:pPr>
+        <w:pStyle w:val="ListParagraph"/>
+        <w:numPr>
+          <w:ilvl w:val="0"/>
+          <w:numId w:val="2"/>
+        </w:numPr>
+        <w:spacing w:after="60"/>
+      </w:pPr>
+      <w:r>
         <w:t xml:space="preserve">Checkable: a whole trip, a trip’s </w:t>
       </w:r>
       <w:r>
@@ -3505,7 +3644,7 @@
         <w:spacing w:after="60"/>
       </w:pPr>
       <w:r>
-        <w:t xml:space="preserve">Holds, top to bottom: the Folder… and Refresh buttons with the root path, the folder tree, the group toggles under an “OSM POIs” master switch, the trail toggles under a “Trails” master switch, a status line and the credit line.</w:t>
+        <w:t xml:space="preserve">Holds, top to bottom: the Folder… and Refresh buttons with the root path, the folder tree, the group toggles under an “OSM POIs” master switch, the trail toggles under a “Trails” master switch, the search bar, a status line and the credit line.</w:t>
       </w:r>
     </w:p>
     <w:p>
@@ -3538,7 +3677,7 @@
         <w:t xml:space="preserve">Remembered between sessions,</w:t>
       </w:r>
       <w:r>
-        <w:t xml:space="preserve"> in one settings file: root folder, ticked items, hidden groups, both master switches, hidden trail categories, camera position and zoom, panel open/closed and width. Windows: %APPDATA%\com.lotanbar.tripexplorer\settings.json; Linux: $XDG_CONFIG_HOME/com.lotanbar.tripexplorer/settings.json. The Overpass cache lives in the matching cache folder.</w:t>
+        <w:t xml:space="preserve"> in one settings file: root folder, ticked items, hidden groups, both master switches, hidden trail categories, camera position and zoom, panel open/closed and width, the unsaved plan. Windows: %APPDATA%\com.lotanbar.tripexplorer\settings.json; Linux: $XDG_CONFIG_HOME/com.lotanbar.tripexplorer/settings.json. The Overpass cache lives in the matching cache folder.</w:t>
       </w:r>
     </w:p>
     <w:p>
@@ -6552,6 +6691,195 @@
         <w:pStyle w:val="Heading2"/>
       </w:pPr>
       <w:r>
+        <w:t xml:space="preserve">Search and plan</w:t>
+      </w:r>
+    </w:p>
+    <w:p>
+      <w:pPr>
+        <w:spacing w:after="120"/>
+      </w:pPr>
+      <w:r>
+        <w:t xml:space="preserve">Search for places and build a plan: an ordered list of stops, saved as a text file and driven on the phone with Waze.</w:t>
+      </w:r>
+    </w:p>
+    <w:p>
+      <w:pPr>
+        <w:pStyle w:val="ListParagraph"/>
+        <w:numPr>
+          <w:ilvl w:val="0"/>
+          <w:numId w:val="2"/>
+        </w:numPr>
+        <w:spacing w:after="60"/>
+      </w:pPr>
+      <w:r>
+        <w:rPr>
+          <w:b/>
+          <w:bCs/>
+        </w:rPr>
+        <w:t xml:space="preserve">Search bar:</w:t>
+      </w:r>
+      <w:r>
+        <w:t xml:space="preserve"> at the bottom of the side panel. Pressing it hides the panel’s controls and shows the search/plan window in their place: the plan’s stops at the top, results below, the search bar at the bottom. A × closes it and brings the controls back.</w:t>
+      </w:r>
+    </w:p>
+    <w:p>
+      <w:pPr>
+        <w:pStyle w:val="ListParagraph"/>
+        <w:numPr>
+          <w:ilvl w:val="0"/>
+          <w:numId w:val="2"/>
+        </w:numPr>
+        <w:spacing w:after="60"/>
+      </w:pPr>
+      <w:r>
+        <w:rPr>
+          <w:b/>
+          <w:bCs/>
+        </w:rPr>
+        <w:t xml:space="preserve">Engine:</w:t>
+      </w:r>
+      <w:r>
+        <w:t xml:space="preserve"> Photon (photon.komoot.io), built on OSM and made for search-as-you-type. Nominatim is not used here because its usage policy forbids autocomplete. Results update live as you type, 300 ms after the last key.</w:t>
+      </w:r>
+    </w:p>
+    <w:p>
+      <w:pPr>
+        <w:pStyle w:val="ListParagraph"/>
+        <w:numPr>
+          <w:ilvl w:val="0"/>
+          <w:numId w:val="2"/>
+        </w:numPr>
+        <w:spacing w:after="60"/>
+      </w:pPr>
+      <w:r>
+        <w:rPr>
+          <w:b/>
+          <w:bCs/>
+        </w:rPr>
+        <w:t xml:space="preserve">Pressing a result</w:t>
+      </w:r>
+      <w:r>
+        <w:t xml:space="preserve"> flies there with a brief zoom-out / zoom-in move.</w:t>
+      </w:r>
+    </w:p>
+    <w:p>
+      <w:pPr>
+        <w:pStyle w:val="ListParagraph"/>
+        <w:numPr>
+          <w:ilvl w:val="0"/>
+          <w:numId w:val="2"/>
+        </w:numPr>
+        <w:spacing w:after="60"/>
+      </w:pPr>
+      <w:r>
+        <w:rPr>
+          <w:b/>
+          <w:bCs/>
+        </w:rPr>
+        <w:t xml:space="preserve">Right-click</w:t>
+      </w:r>
+      <w:r>
+        <w:t xml:space="preserve"> an OSM POI, one of my POIs or a search result (on the map or in the list) adds it to the end of the plan. Right-clicking it again, or its entry in the plan, removes it.</w:t>
+      </w:r>
+    </w:p>
+    <w:p>
+      <w:pPr>
+        <w:pStyle w:val="ListParagraph"/>
+        <w:numPr>
+          <w:ilvl w:val="0"/>
+          <w:numId w:val="2"/>
+        </w:numPr>
+        <w:spacing w:after="60"/>
+      </w:pPr>
+      <w:r>
+        <w:rPr>
+          <w:b/>
+          <w:bCs/>
+        </w:rPr>
+        <w:t xml:space="preserve">Plan list:</w:t>
+      </w:r>
+      <w:r>
+        <w:t xml:space="preserve"> the stops show numbered 1, 2, 3… at the top of the window. Drag an entry to reorder. Pressing an entry flies to it and opens its web search in the embedded browser, as a click on the POI would; the browser covers the window, and Esc or a click on empty map brings it back with the plan intact.</w:t>
+      </w:r>
+    </w:p>
+    <w:p>
+      <w:pPr>
+        <w:pStyle w:val="ListParagraph"/>
+        <w:numPr>
+          <w:ilvl w:val="0"/>
+          <w:numId w:val="2"/>
+        </w:numPr>
+        <w:spacing w:after="60"/>
+      </w:pPr>
+      <w:r>
+        <w:rPr>
+          <w:b/>
+          <w:bCs/>
+        </w:rPr>
+        <w:t xml:space="preserve">Save:</w:t>
+      </w:r>
+      <w:r>
+        <w:t xml:space="preserve"> type a plan name and press Save: the app writes trips/plans/&lt;name&gt;.txt (creating plans/ if needed) and clears the list for a new plan. Name rules apply.</w:t>
+      </w:r>
+    </w:p>
+    <w:p>
+      <w:pPr>
+        <w:pStyle w:val="ListParagraph"/>
+        <w:numPr>
+          <w:ilvl w:val="0"/>
+          <w:numId w:val="2"/>
+        </w:numPr>
+        <w:spacing w:after="60"/>
+      </w:pPr>
+      <w:r>
+        <w:rPr>
+          <w:b/>
+          <w:bCs/>
+        </w:rPr>
+        <w:t xml:space="preserve">Plans button:</w:t>
+      </w:r>
+      <w:r>
+        <w:t xml:space="preserve"> lists the saved plans. Picking one loads it into the window for editing; Save then overwrites that same file.</w:t>
+      </w:r>
+    </w:p>
+    <w:p>
+      <w:pPr>
+        <w:pStyle w:val="ListParagraph"/>
+        <w:numPr>
+          <w:ilvl w:val="0"/>
+          <w:numId w:val="2"/>
+        </w:numPr>
+        <w:spacing w:after="60"/>
+      </w:pPr>
+      <w:r>
+        <w:rPr>
+          <w:b/>
+          <w:bCs/>
+        </w:rPr>
+        <w:t xml:space="preserve">Unsaved plan:</w:t>
+      </w:r>
+      <w:r>
+        <w:t xml:space="preserve"> the plan being built is kept in the settings file, so it survives web searches, closing the window and restarting the app. It is written to plans/ only on Save.</w:t>
+      </w:r>
+    </w:p>
+    <w:p>
+      <w:pPr>
+        <w:pStyle w:val="ListParagraph"/>
+        <w:numPr>
+          <w:ilvl w:val="0"/>
+          <w:numId w:val="2"/>
+        </w:numPr>
+        <w:spacing w:after="60"/>
+      </w:pPr>
+      <w:r>
+        <w:t xml:space="preserve">Removing a stop only changes the list; plan files are deleted only in the file manager.</w:t>
+      </w:r>
+    </w:p>
+    <w:p>
+      <w:pPr>
+        <w:pStyle w:val="Heading2"/>
+      </w:pPr>
+      <w:r>
         <w:t>Embedded browser</w:t>
       </w:r>
     </w:p>
@@ -6865,7 +7193,7 @@
         <w:spacing w:after="60"/>
       </w:pPr>
       <w:r>
-        <w:t>ChatGPT POIs and trip planning.</w:t>
+        <w:t>ChatGPT POIs.</w:t>
       </w:r>
     </w:p>
     <w:p>

</xml_diff>

<commit_message>
Spec: search bar always visible, right-click opens the window, results on the map, window state remembered, case-insensitive plan names
Co-Authored-By: Claude Fable 5.1 <noreply@anthropic.com>
</commit_message>
<xml_diff>
--- a/docs/Trip_Explorer_Spec.docx
+++ b/docs/Trip_Explorer_Spec.docx
@@ -1019,7 +1019,7 @@
         <w:spacing w:after="60"/>
       </w:pPr>
       <w:r>
-        <w:t xml:space="preserve">Plan names follow the same rules; a plan name already used is refused.</w:t>
+        <w:t xml:space="preserve">Plan names follow the same rules; a plan name already used is refused, ignoring case, unless it is the name of the plan that was loaded (Save then overwrites it).</w:t>
       </w:r>
     </w:p>
     <w:p>
@@ -3677,7 +3677,7 @@
         <w:t xml:space="preserve">Remembered between sessions,</w:t>
       </w:r>
       <w:r>
-        <w:t xml:space="preserve"> in one settings file: root folder, ticked items, hidden groups, both master switches, hidden trail categories, camera position and zoom, panel open/closed and width, the unsaved plan. Windows: %APPDATA%\com.lotanbar.tripexplorer\settings.json; Linux: $XDG_CONFIG_HOME/com.lotanbar.tripexplorer/settings.json. The Overpass cache lives in the matching cache folder.</w:t>
+        <w:t xml:space="preserve"> in one settings file: root folder, ticked items, hidden groups, both master switches, hidden trail categories, camera position and zoom, panel open/closed and width, the unsaved plan and whether the search/plan window is open. Windows: %APPDATA%\com.lotanbar.tripexplorer\settings.json; Linux: $XDG_CONFIG_HOME/com.lotanbar.tripexplorer/settings.json. The Overpass cache lives in the matching cache folder.</w:t>
       </w:r>
     </w:p>
     <w:p>
@@ -6719,7 +6719,7 @@
         <w:t xml:space="preserve">Search bar:</w:t>
       </w:r>
       <w:r>
-        <w:t xml:space="preserve"> at the bottom of the side panel. Pressing it hides the panel’s controls and shows the search/plan window in their place: the plan’s stops at the top, results below, the search bar at the bottom. A × closes it and brings the controls back.</w:t>
+        <w:t xml:space="preserve"> always at the bottom of the side panel, above the status line. Typing in it hides the panel’s controls and shows the search/plan window in their place: the plan’s stops at the top, results below, the search bar still at the bottom. A × closes it and brings the controls back. Whether the window is open is remembered between sessions.</w:t>
       </w:r>
     </w:p>
     <w:p>
@@ -6739,7 +6739,7 @@
         <w:t xml:space="preserve">Engine:</w:t>
       </w:r>
       <w:r>
-        <w:t xml:space="preserve"> Photon (photon.komoot.io), built on OSM and made for search-as-you-type. Nominatim is not used here because its usage policy forbids autocomplete. Results update live as you type, 300 ms after the last key.</w:t>
+        <w:t xml:space="preserve"> Photon (photon.komoot.io), built on OSM and made for search-as-you-type. Nominatim is not used here because its usage policy forbids autocomplete. Results update live as you type, 300 ms after the last key, biased towards the map centre, up to 12 of them. They are listed in the window and drawn on the map as blue markers with their names; both go away when the window closes.</w:t>
       </w:r>
     </w:p>
     <w:p>
@@ -6779,7 +6779,7 @@
         <w:t xml:space="preserve">Right-click</w:t>
       </w:r>
       <w:r>
-        <w:t xml:space="preserve"> an OSM POI, one of my POIs or a search result (on the map or in the list) adds it to the end of the plan. Right-clicking it again, or its entry in the plan, removes it.</w:t>
+        <w:t xml:space="preserve"> an OSM POI, one of my POIs or a search result (on the map or in the list) adds it to the end of the plan; it works at any time, and when the window is closed it opens it. Right-clicking it again, or its entry in the plan, removes it.</w:t>
       </w:r>
     </w:p>
     <w:p>

</xml_diff>

<commit_message>
Search also finds my own POIs by name (listed first, amber dot); plan entries of my POIs open their folder
Co-Authored-By: Claude Fable 5.1 <noreply@anthropic.com>
</commit_message>
<xml_diff>
--- a/docs/Trip_Explorer_Spec.docx
+++ b/docs/Trip_Explorer_Spec.docx
@@ -3488,7 +3488,7 @@
         <w:t xml:space="preserve">No map controls:</w:t>
       </w:r>
       <w:r>
-        <w:t xml:space="preserve"> no zoom buttons, scale bar or attribution control. The credits are one line at the bottom of the side panel.</w:t>
+        <w:t xml:space="preserve"> no zoom buttons, scale bar or attribution control, and no credit line (a personal app).</w:t>
       </w:r>
     </w:p>
     <w:p>
@@ -3644,20 +3644,20 @@
         <w:spacing w:after="60"/>
       </w:pPr>
       <w:r>
-        <w:t xml:space="preserve">Holds, top to bottom: the Folder… and Refresh buttons with the root path, the folder tree, the group toggles under an “OSM POIs” master switch, the trail toggles under a “Trails” master switch, the search bar, a status line and the credit line.</w:t>
-      </w:r>
-    </w:p>
-    <w:p>
-      <w:pPr>
-        <w:pStyle w:val="ListParagraph"/>
-        <w:numPr>
-          <w:ilvl w:val="0"/>
-          <w:numId w:val="2"/>
-        </w:numPr>
-        <w:spacing w:after="60"/>
-      </w:pPr>
-      <w:r>
-        <w:t xml:space="preserve">A drag handle on its right edge resizes it, from 340 px up to the whole window (the handle always stays on screen). The × closes it; a menu button at the bottom left of the map opens it again.</w:t>
+        <w:t xml:space="preserve">Holds, top to bottom: the Folder… and Refresh buttons with the root path, the folder tree, the group toggles under an “OSM POIs” master switch, the trail toggles under a “Trails” master switch, and the search bar at the very bottom. A status line appears under the bar only while it has a message.</w:t>
+      </w:r>
+    </w:p>
+    <w:p>
+      <w:pPr>
+        <w:pStyle w:val="ListParagraph"/>
+        <w:numPr>
+          <w:ilvl w:val="0"/>
+          <w:numId w:val="2"/>
+        </w:numPr>
+        <w:spacing w:after="60"/>
+      </w:pPr>
+      <w:r>
+        <w:t xml:space="preserve">A drag handle on its right edge resizes it, from 340 px up to the whole window (the handle always stays on screen). When the window is made narrower the panel gives way first, down to 340 px, the map keeping its width; then the map shrinks, down to nothing. The window itself has no real minimum size. The × closes it; a menu button at the bottom left of the map opens it again.</w:t>
       </w:r>
     </w:p>
     <w:p>
@@ -6719,7 +6719,7 @@
         <w:t xml:space="preserve">Search bar:</w:t>
       </w:r>
       <w:r>
-        <w:t xml:space="preserve"> always at the bottom of the side panel, above the status line. Typing in it hides the panel’s controls and shows the search/plan window in their place: the plan’s stops at the top, results below, the search bar still at the bottom. A × closes it and brings the controls back. Whether the window is open is remembered between sessions.</w:t>
+        <w:t xml:space="preserve"> always at the very bottom of the side panel, with a Plans button beside it. Typing in the bar, or pressing Plans, hides the panel’s controls and shows the search/plan window in their place: the plan’s stops at the top, results below, the search bar still at the bottom. A × closes it and brings the controls back. Whether the window is open is remembered between sessions.</w:t>
       </w:r>
     </w:p>
     <w:p>
@@ -6739,7 +6739,7 @@
         <w:t xml:space="preserve">Engine:</w:t>
       </w:r>
       <w:r>
-        <w:t xml:space="preserve"> Photon (photon.komoot.io), built on OSM and made for search-as-you-type. Nominatim is not used here because its usage policy forbids autocomplete. Results update live as you type, 300 ms after the last key, biased towards the map centre, up to 12 of them. They are listed in the window and drawn on the map as blue markers with their names; both go away when the window closes.</w:t>
+        <w:t xml:space="preserve"> Photon (photon.komoot.io), built on OSM and made for search-as-you-type. Nominatim is not used here because its usage policy forbids autocomplete. Results update live as you type, 300 ms after the last key, biased towards the map centre, up to 12 of them. My own POIs (from every trip) whose name contains the text are listed first, marked “my POI” with the trip name and an amber dot. Results are drawn on the map as blue markers with their names (my POIs already ticked keep their own marker); both go away when the window closes.</w:t>
       </w:r>
     </w:p>
     <w:p>
@@ -6799,7 +6799,7 @@
         <w:t xml:space="preserve">Plan list:</w:t>
       </w:r>
       <w:r>
-        <w:t xml:space="preserve"> the stops show numbered 1, 2, 3… at the top of the window. Drag an entry to reorder. Pressing an entry flies to it and opens its web search in the embedded browser, as a click on the POI would; the browser covers the window, and Esc or a click on empty map brings it back with the plan intact.</w:t>
+        <w:t xml:space="preserve"> the stops show numbered 1, 2, 3… at the top of the window. The list is not shown while the plan is empty, and grows with the stops (up to half the window), so the results get the most room. Drag an entry to reorder. Pressing an entry flies to it and opens it as a click on the POI would (one of my POIs: its folder; anything else: its web search in the embedded browser); the browser covers the window, and Esc or a click on empty map brings it back with the plan intact.</w:t>
       </w:r>
     </w:p>
     <w:p>

</xml_diff>

<commit_message>
Alt+Left / Alt+Right step through the pages opened in the browser
An in-memory history of the browser's visits (a POI's search, a place, a
trail's website), gone when the app closes: the shortcut reopens the page
and flies the map to its POI. Inside the browser the keys are reported by
navigating to a history.trip-explorer.invalid URL that the backend
cancels and turns into the browser-history event; the old browser_history
command (the page's own back/forward) is gone. Spec and README updated.

Co-Authored-By: Claude Fable 5.1 <noreply@anthropic.com>
</commit_message>
<xml_diff>
--- a/docs/Trip_Explorer_Spec.docx
+++ b/docs/Trip_Explorer_Spec.docx
@@ -4131,7 +4131,7 @@
           </w:tcPr>
           <w:p>
             <w:r>
-              <w:t xml:space="preserve">Closes the embedded browser and shows the side panel again</w:t>
+              <w:t xml:space="preserve">Closes the embedded browser and shows the side panel again (opening the search window does the same)</w:t>
             </w:r>
           </w:p>
         </w:tc>
@@ -6779,7 +6779,7 @@
         <w:t xml:space="preserve">Right-click</w:t>
       </w:r>
       <w:r>
-        <w:t xml:space="preserve"> an OSM POI, one of my POIs or a search result (on the map or in the list) adds it to the end of the plan; it works at any time, and when the window is closed it opens it. Right-clicking it again, or its entry in the plan, removes it.</w:t>
+        <w:t xml:space="preserve"> an OSM POI, one of my POIs or a search result (on the map or in the list) adds it to the end of the plan; it works at any time and from any screen: when the window is closed it opens it, and when the embedded browser is showing, the browser closes so the window is seen. Right-clicking it again, or its entry in the plan, removes it.</w:t>
       </w:r>
     </w:p>
     <w:p>
@@ -6928,7 +6928,7 @@
         <w:t xml:space="preserve">Navigation:</w:t>
       </w:r>
       <w:r>
-        <w:t xml:space="preserve"> links open in place, including new-window links (which the embedded web view would otherwise drop). Alt+Left / Alt+Right go back and forward, also while the map has focus.</w:t>
+        <w:t xml:space="preserve"> links open in place, including new-window links (which the embedded web view would otherwise drop). Alt+Left / Alt+Right step through the history of pages opened in the browser (see below), also while the map has focus.</w:t>
       </w:r>
     </w:p>
     <w:p>
@@ -7008,6 +7008,26 @@
       </w:pPr>
       <w:r>
         <w:t xml:space="preserve">Any other site is shown as is, except that new-window links open in place and Alt+arrows work.</w:t>
+      </w:r>
+    </w:p>
+    <w:p>
+      <w:pPr>
+        <w:pStyle w:val="ListParagraph"/>
+        <w:numPr>
+          <w:ilvl w:val="0"/>
+          <w:numId w:val="2"/>
+        </w:numPr>
+        <w:spacing w:after="60"/>
+      </w:pPr>
+      <w:r>
+        <w:rPr>
+          <w:b/>
+          <w:bCs/>
+        </w:rPr>
+        <w:t xml:space="preserve">History:</w:t>
+      </w:r>
+      <w:r>
+        <w:t xml:space="preserve"> every page opened in the browser (a POI’s search, a place, a trail’s website) is a visit. Alt+Left / Alt+Right step back and forward through the visits, reopening the page and flying the map to its POI; opening a new page after stepping back drops the visits after it. The history is kept in memory only and starts empty each time the app starts.</w:t>
       </w:r>
     </w:p>
     <w:p>

</xml_diff>

<commit_message>
Spec: plan window as built (results on top, Plans menu in the search bar, temp plan vs saved plans, 5 s New plan guard, unsaved-changes prompt, GPX import/export), panel minimum 357 px
Co-Authored-By: Claude Opus 5.5 <noreply@anthropic.com>
</commit_message>
<xml_diff>
--- a/docs/Trip_Explorer_Spec.docx
+++ b/docs/Trip_Explorer_Spec.docx
@@ -1019,7 +1019,7 @@
         <w:spacing w:after="60"/>
       </w:pPr>
       <w:r>
-        <w:t xml:space="preserve">Plan names follow the same rules; a plan name already used is refused, ignoring case, unless it is the name of the plan that was loaded (Save then overwrites it).</w:t>
+        <w:t xml:space="preserve">Plan names follow the same rules; a plan name already used is refused, ignoring case, unless it is the name of the saved plan being shown (Save then overwrites it).</w:t>
       </w:r>
     </w:p>
     <w:p>
@@ -3657,7 +3657,7 @@
         <w:spacing w:after="60"/>
       </w:pPr>
       <w:r>
-        <w:t xml:space="preserve">A drag handle on its right edge resizes it, from 340 px up to the whole window (the handle always stays on screen). When the window is made narrower the panel gives way first, down to 340 px, the map keeping its width; then the map shrinks, down to nothing. The window itself has no real minimum size. The × closes it; a menu button at the bottom left of the map opens it again.</w:t>
+        <w:t xml:space="preserve">A drag handle on its right edge resizes it, from 357 px up to the whole window (the handle always stays on screen). When the window is made narrower the panel gives way first, down to 357 px, the map keeping its width; then the map shrinks, down to nothing. The window itself has no real minimum size. The × closes it; a menu button at the bottom left of the map opens it again.</w:t>
       </w:r>
     </w:p>
     <w:p>
@@ -3677,7 +3677,7 @@
         <w:t xml:space="preserve">Remembered between sessions,</w:t>
       </w:r>
       <w:r>
-        <w:t xml:space="preserve"> in one settings file: root folder, ticked items, hidden groups, both master switches, hidden trail categories, camera position and zoom, panel open/closed and width, the unsaved plan and whether the search/plan window is open. Windows: %APPDATA%\com.lotanbar.tripexplorer\settings.json; Linux: $XDG_CONFIG_HOME/com.lotanbar.tripexplorer/settings.json. The Overpass cache lives in the matching cache folder.</w:t>
+        <w:t xml:space="preserve"> in one settings file: root folder, ticked items, hidden groups, both master switches, hidden trail categories, camera position and zoom, panel open/closed and width, the temp plan and whether the search/plan window is open. Windows: %APPDATA%\com.lotanbar.tripexplorer\settings.json; Linux: $XDG_CONFIG_HOME/com.lotanbar.tripexplorer/settings.json. The Overpass cache lives in the matching cache folder.</w:t>
       </w:r>
     </w:p>
     <w:p>
@@ -6719,7 +6719,7 @@
         <w:t xml:space="preserve">Search bar:</w:t>
       </w:r>
       <w:r>
-        <w:t xml:space="preserve"> always at the very bottom of the side panel, with a Plans button beside it. Typing in the bar, or pressing Plans, hides the panel’s controls and shows the search/plan window in their place: the plan’s stops at the top, results below, the search bar still at the bottom. A × closes it and brings the controls back. Whether the window is open is remembered between sessions.</w:t>
+        <w:t xml:space="preserve"> always at the very bottom of the side panel, with the Plans menu beside it; neither moves when the window opens or closes. Typing in the bar, or picking an entry in the Plans menu, hides the panel’s controls and shows the search/plan window in their place: the results at the top, the plan below them, the search bar still at the bottom. A × (top right, beside Results) closes it and brings the controls back. Whether the window is open is remembered between sessions.</w:t>
       </w:r>
     </w:p>
     <w:p>
@@ -6799,7 +6799,7 @@
         <w:t xml:space="preserve">Plan list:</w:t>
       </w:r>
       <w:r>
-        <w:t xml:space="preserve"> the stops show numbered 1, 2, 3… at the top of the window. The list is not shown while the plan is empty, and grows with the stops (up to half the window), so the results get the most room. Drag an entry to reorder. Pressing an entry flies to it and opens it as a click on the POI would (one of my POIs: its folder; anything else: its web search in the embedded browser); the browser covers the window, and Esc or a click on empty map brings it back with the plan intact.</w:t>
+        <w:t xml:space="preserve"> the stops show numbered 1, 2, 3… under the plan’s head (its title, name, Save and the GPX import/export icons), just above the search bar. The list is not shown while the plan is empty, and grows with the stops (up to about half the window). Drag an entry to reorder. Pressing an entry flies to it and opens it as a click on the POI would (one of my POIs: its folder; anything else: its web search in the embedded browser); the browser covers the window, and Esc or a click on empty map brings it back with the plan intact.</w:t>
       </w:r>
     </w:p>
     <w:p>
@@ -6819,7 +6819,7 @@
         <w:t xml:space="preserve">Save:</w:t>
       </w:r>
       <w:r>
-        <w:t xml:space="preserve"> type a plan name and press Save: the app writes trips/plans/&lt;name&gt;.txt (creating plans/ if needed) and clears the list for a new plan. Name rules apply.</w:t>
+        <w:t xml:space="preserve"> type a plan name and press Save: the app writes trips/plans/&lt;name&gt;.txt (creating plans/ if needed). Saving the temp plan turns it into that saved plan and starts a new, empty temp plan. Saving a saved plan overwrites its file, or, under a new name, writes a new file (the old one stays). Name rules apply.</w:t>
       </w:r>
     </w:p>
     <w:p>
@@ -6836,10 +6836,10 @@
           <w:b/>
           <w:bCs/>
         </w:rPr>
-        <w:t xml:space="preserve">Plans button:</w:t>
-      </w:r>
-      <w:r>
-        <w:t xml:space="preserve"> lists the saved plans. Picking one loads it into the window for editing; Save then overwrites that same file.</w:t>
+        <w:t xml:space="preserve">Plans menu:</w:t>
+      </w:r>
+      <w:r>
+        <w:t xml:space="preserve"> opens upward from the Plans button and lists New plan; Continue current plan (only while the temp plan has stops); then every saved plan, the one shown marked. Each entry opens the window.</w:t>
       </w:r>
     </w:p>
     <w:p>
@@ -6856,10 +6856,70 @@
           <w:b/>
           <w:bCs/>
         </w:rPr>
-        <w:t xml:space="preserve">Unsaved plan:</w:t>
-      </w:r>
-      <w:r>
-        <w:t xml:space="preserve"> the plan being built is kept in the settings file, so it survives web searches, closing the window and restarting the app. It is written to plans/ only on Save.</w:t>
+        <w:t xml:space="preserve">Temp plan:</w:t>
+      </w:r>
+      <w:r>
+        <w:t xml:space="preserve"> there is exactly one; while it is shown, right-clicks add to it and remove from it (while a saved plan is shown, they edit that one). It is kept in the settings file, so it survives web searches, closing the window, showing a saved plan and restarting the app. It is written to plans/ only on Save. The plan head says “Temp plan” or “Saved plan”.</w:t>
+      </w:r>
+    </w:p>
+    <w:p>
+      <w:pPr>
+        <w:pStyle w:val="ListParagraph"/>
+        <w:numPr>
+          <w:ilvl w:val="0"/>
+          <w:numId w:val="2"/>
+        </w:numPr>
+        <w:spacing w:after="60"/>
+      </w:pPr>
+      <w:r>
+        <w:rPr>
+          <w:b/>
+          <w:bCs/>
+        </w:rPr>
+        <w:t xml:space="preserve">New plan:</w:t>
+      </w:r>
+      <w:r>
+        <w:t xml:space="preserve"> starts an empty temp plan. If the temp plan has stops, a box asks first; its “Discard and start new” button stays disabled for 5 seconds, counting down, so the temp plan cannot be thrown away by accident.</w:t>
+      </w:r>
+    </w:p>
+    <w:p>
+      <w:pPr>
+        <w:pStyle w:val="ListParagraph"/>
+        <w:numPr>
+          <w:ilvl w:val="0"/>
+          <w:numId w:val="2"/>
+        </w:numPr>
+        <w:spacing w:after="60"/>
+      </w:pPr>
+      <w:r>
+        <w:rPr>
+          <w:b/>
+          <w:bCs/>
+        </w:rPr>
+        <w:t xml:space="preserve">Saved plans:</w:t>
+      </w:r>
+      <w:r>
+        <w:t xml:space="preserve"> picking one shows it in place of the temp plan, which is kept as it is. Its edits (right-click, drag, import, renaming) stay in memory until Save; the head then reads “Saved plan •”. Leaving it with unsaved edits (×, New plan, Continue current plan, or another plan) asks: Save, Discard changes or Cancel.</w:t>
+      </w:r>
+    </w:p>
+    <w:p>
+      <w:pPr>
+        <w:pStyle w:val="ListParagraph"/>
+        <w:numPr>
+          <w:ilvl w:val="0"/>
+          <w:numId w:val="2"/>
+        </w:numPr>
+        <w:spacing w:after="60"/>
+      </w:pPr>
+      <w:r>
+        <w:rPr>
+          <w:b/>
+          <w:bCs/>
+        </w:rPr>
+        <w:t xml:space="preserve">GPX import and export:</w:t>
+      </w:r>
+      <w:r>
+        <w:t xml:space="preserve"> two icons in the plan head. Import picks a .gpx file and adds its waypoints (or, in a file without any, its route points; track points are ignored) to the end of the plan shown, in file order, skipping ones already in it; a plan with no name takes the file’s name. Export writes the plan shown as a GPX 1.1 file of waypoints, in plan order, where the user picks. Both use the system file dialog.</w:t>
       </w:r>
     </w:p>
     <w:p>

</xml_diff>

<commit_message>
Spec: screen history (Alt+arrows), empty-map click back to the controls, Plans section, no stop numbers
Co-Authored-By: Claude Opus 5.5 <noreply@anthropic.com>
</commit_message>
<xml_diff>
--- a/docs/Trip_Explorer_Spec.docx
+++ b/docs/Trip_Explorer_Spec.docx
@@ -3644,7 +3644,7 @@
         <w:spacing w:after="60"/>
       </w:pPr>
       <w:r>
-        <w:t xml:space="preserve">Holds, top to bottom: the Folder… and Refresh buttons with the root path, the folder tree, the group toggles under an “OSM POIs” master switch, the trail toggles under a “Trails” master switch, and the search bar at the very bottom. A status line appears under the bar only while it has a message.</w:t>
+        <w:t xml:space="preserve">Holds, top to bottom: the Folder… and Refresh buttons with the root path, the folder tree, the saved plans, the group toggles under an “OSM POIs” master switch, the trail toggles under a “Trails” master switch, and the search bar at the very bottom. A status line appears under the bar only while it has a message. The folder tree and the plans take the room left over and scroll inside their own sections (the plans at most about a quarter of the panel); the group and trail toggles keep their size.</w:t>
       </w:r>
     </w:p>
     <w:p>
@@ -3658,6 +3658,19 @@
       </w:pPr>
       <w:r>
         <w:t xml:space="preserve">A drag handle on its right edge resizes it, from 357 px up to the whole window (the handle always stays on screen). When the window is made narrower the panel gives way first, down to 357 px, the map keeping its width; then the map shrinks, down to nothing. The window itself has no real minimum size. The × closes it; a menu button at the bottom left of the map opens it again.</w:t>
+      </w:r>
+    </w:p>
+    <w:p>
+      <w:pPr>
+        <w:pStyle w:val="ListParagraph"/>
+        <w:numPr>
+          <w:ilvl w:val="0"/>
+          <w:numId w:val="2"/>
+        </w:numPr>
+        <w:spacing w:after="60"/>
+      </w:pPr>
+      <w:r>
+        <w:t xml:space="preserve">Plans: every file in trips/plans/, one row per plan with a checkbox and the plan’s colour (from its name, like a trip’s); an arrow shows or hides its stops, each with its own checkbox. Ticking a plan ticks all its stops. Ticked stops are drawn on the map as dots in the plan’s colour, with their names from zoom 11; clicking one opens its web search. A plan is a group of places, not a route: no numbers are shown, in the panel or on the map. Ticks are remembered with the others; the list is read again on Refresh and after every Save.</w:t>
       </w:r>
     </w:p>
     <w:p>
@@ -4131,7 +4144,7 @@
           </w:tcPr>
           <w:p>
             <w:r>
-              <w:t xml:space="preserve">Closes the embedded browser and shows the side panel again (opening the search window does the same)</w:t>
+              <w:t xml:space="preserve">Goes back to the side panel’s controls: closes the embedded browser and the search/plan window (asking first when a saved plan with unsaved changes is shown)</w:t>
             </w:r>
           </w:p>
         </w:tc>
@@ -6799,7 +6812,7 @@
         <w:t xml:space="preserve">Plan list:</w:t>
       </w:r>
       <w:r>
-        <w:t xml:space="preserve"> the stops show numbered 1, 2, 3… under the plan’s head (its title, name, Save and the GPX import/export icons), just above the search bar. The list is not shown while the plan is empty, and grows with the stops (up to about half the window). Drag an entry to reorder. Pressing an entry flies to it and opens it as a click on the POI would (one of my POIs: its folder; anything else: its web search in the embedded browser); the browser covers the window, and Esc or a click on empty map brings it back with the plan intact.</w:t>
+        <w:t xml:space="preserve"> the stops show under the plan’s head (its title, name, Save and the GPX import/export icons), just above the search bar, each with a plain dot: no numbers, since a plan is a group of places rather than a route (the file still keeps the order). The list is not shown while the plan is empty, and grows with the stops (up to about half the window). Drag an entry to reorder. Pressing an entry flies to it and opens it as a click on the POI would (one of my POIs: its folder; anything else: its web search in the embedded browser); the browser covers the window, and Esc brings the window back with the plan intact.</w:t>
       </w:r>
     </w:p>
     <w:p>
@@ -6968,7 +6981,7 @@
         <w:t xml:space="preserve">Closing:</w:t>
       </w:r>
       <w:r>
-        <w:t xml:space="preserve"> Esc, or a click on an empty spot of the map, closes it and shows the panel again. Clicking another POI, trail or place label replaces the page.</w:t>
+        <w:t xml:space="preserve"> Esc closes it and shows the panel again; a click on an empty spot of the map goes all the way back to the controls. Clicking another POI, trail or place label replaces the page.</w:t>
       </w:r>
     </w:p>
     <w:p>
@@ -6988,7 +7001,7 @@
         <w:t xml:space="preserve">Navigation:</w:t>
       </w:r>
       <w:r>
-        <w:t xml:space="preserve"> links open in place, including new-window links (which the embedded web view would otherwise drop). Alt+Left / Alt+Right step through the history of pages opened in the browser (see below), also while the map has focus.</w:t>
+        <w:t xml:space="preserve"> links open in place, including new-window links (which the embedded web view would otherwise drop). While the browser has the keyboard, Alt+Left / Alt+Right are its own back and forward.</w:t>
       </w:r>
     </w:p>
     <w:p>
@@ -7087,7 +7100,7 @@
         <w:t xml:space="preserve">History:</w:t>
       </w:r>
       <w:r>
-        <w:t xml:space="preserve"> every page opened in the browser (a POI’s search, a place, a trail’s website) is a visit. Alt+Left / Alt+Right step back and forward through the visits, reopening the page and flying the map to its POI; opening a new page after stepping back drops the visits after it. The history is kept in memory only and starts empty each time the app starts.</w:t>
+        <w:t xml:space="preserve"> the side panel remembers the screens it showed: the controls, the search/plan window (with the temp plan or a saved one) and each page opened in the browser. With the map or the panel focused, Alt+Left / Alt+Right step back and forward through them, bringing the screen back (a page also flies the map to its POI; a screen brought back this way leaves the keyboard with the map, so the keys keep walking the history). Leaving a saved plan with unsaved changes this way asks first, as elsewhere. Showing a new screen after stepping back drops the ones after it. The history is kept in memory only and starts empty each time the app starts.</w:t>
       </w:r>
     </w:p>
     <w:p>

</xml_diff>

<commit_message>
Spec: Google Drive sync (Drive is the truth, newest wins, live on PC, Sync switch on the phone)
Co-Authored-By: Claude Opus 5.5 <noreply@anthropic.com>
</commit_message>
<xml_diff>
--- a/docs/Trip_Explorer_Spec.docx
+++ b/docs/Trip_Explorer_Spec.docx
@@ -18,7 +18,7 @@
         <w:rPr>
           <w:color w:val="666666"/>
         </w:rPr>
-        <w:t>Sep 21, 2026 · @Someone · updated Sep 23, 2026 (phone app as built)</w:t>
+        <w:t>Sep 21, 2026 · @Someone · updated Sep 24, 2026 (Google Drive sync)</w:t>
       </w:r>
     </w:p>
     <w:p>
@@ -111,10 +111,10 @@
           <w:b/>
           <w:bCs/>
         </w:rPr>
-        <w:t>Neither app ever deletes anything.</w:t>
-      </w:r>
-      <w:r>
-        <w:t xml:space="preserve"> Deleting is done only in the file manager.</w:t>
+        <w:t>Neither app deletes anything on its own.</w:t>
+      </w:r>
+      <w:r>
+        <w:t xml:space="preserve"> Deleting is done in the file manager; the only exception is Google Drive sync, which carries a removal made on one side over to the other (see Google Drive sync).</w:t>
       </w:r>
     </w:p>
     <w:p>
@@ -7259,6 +7259,214 @@
         <w:pStyle w:val="Heading1"/>
       </w:pPr>
       <w:r>
+        <w:t xml:space="preserve">Google Drive sync</w:t>
+      </w:r>
+    </w:p>
+    <w:p>
+      <w:r>
+        <w:t xml:space="preserve">Both apps keep the whole trips/ folder in sync with one folder on my Google Drive, built into the apps (no third-party sync app). I am the only user; edits never happen on both sides at the same time.</w:t>
+      </w:r>
+    </w:p>
+    <w:p>
+      <w:pPr>
+        <w:pStyle w:val="ListParagraph"/>
+        <w:numPr>
+          <w:ilvl w:val="0"/>
+          <w:numId w:val="2"/>
+        </w:numPr>
+        <w:spacing w:after="60"/>
+      </w:pPr>
+      <w:r>
+        <w:rPr>
+          <w:b/>
+          <w:bCs/>
+        </w:rPr>
+        <w:t xml:space="preserve">Drive is the truth:</w:t>
+      </w:r>
+      <w:r>
+        <w:t xml:space="preserve"> the Drive folder is the master copy. Each app keeps a full local copy (the phone in /sdcard/trips, the PC in its trips folder) and works on it as before.</w:t>
+      </w:r>
+    </w:p>
+    <w:p>
+      <w:pPr>
+        <w:pStyle w:val="ListParagraph"/>
+        <w:numPr>
+          <w:ilvl w:val="0"/>
+          <w:numId w:val="2"/>
+        </w:numPr>
+        <w:spacing w:after="60"/>
+      </w:pPr>
+      <w:r>
+        <w:rPr>
+          <w:b/>
+          <w:bCs/>
+        </w:rPr>
+        <w:t xml:space="preserve">What is synced:</w:t>
+      </w:r>
+      <w:r>
+        <w:t xml:space="preserve"> everything inside trips/: trips, POI folders and media, recordings (including an unfinished recording, uploaded on every 10 s save) and plans/.</w:t>
+      </w:r>
+    </w:p>
+    <w:p>
+      <w:pPr>
+        <w:pStyle w:val="ListParagraph"/>
+        <w:numPr>
+          <w:ilvl w:val="0"/>
+          <w:numId w:val="2"/>
+        </w:numPr>
+        <w:spacing w:after="60"/>
+      </w:pPr>
+      <w:r>
+        <w:rPr>
+          <w:b/>
+          <w:bCs/>
+        </w:rPr>
+        <w:t xml:space="preserve">Newest wins:</w:t>
+      </w:r>
+      <w:r>
+        <w:t xml:space="preserve"> a file changed on one side is copied to the other. If the same file changed on both sides, the newer change wins.</w:t>
+      </w:r>
+    </w:p>
+    <w:p>
+      <w:pPr>
+        <w:pStyle w:val="ListParagraph"/>
+        <w:numPr>
+          <w:ilvl w:val="0"/>
+          <w:numId w:val="2"/>
+        </w:numPr>
+        <w:spacing w:after="60"/>
+      </w:pPr>
+      <w:r>
+        <w:rPr>
+          <w:b/>
+          <w:bCs/>
+        </w:rPr>
+        <w:t xml:space="preserve">Renames and removals:</w:t>
+      </w:r>
+      <w:r>
+        <w:t xml:space="preserve"> a file renamed or moved (a renamed POI, a stopped recording, a hidden group file) is renamed or moved on Drive, not uploaded again. A file removed on one side is removed on the other; on Drive it goes to the trash (kept 30 days).</w:t>
+      </w:r>
+    </w:p>
+    <w:p>
+      <w:pPr>
+        <w:pStyle w:val="ListParagraph"/>
+        <w:numPr>
+          <w:ilvl w:val="0"/>
+          <w:numId w:val="2"/>
+        </w:numPr>
+        <w:spacing w:after="60"/>
+      </w:pPr>
+      <w:r>
+        <w:rPr>
+          <w:b/>
+          <w:bCs/>
+        </w:rPr>
+        <w:t xml:space="preserve">Setup:</w:t>
+      </w:r>
+      <w:r>
+        <w:t xml:space="preserve"> sign in with Google once, then pick the Drive folder in the app’s own folder list. Full Drive access; the sign-in page warns once that the app is unverified (it is a personal app, not published).</w:t>
+      </w:r>
+    </w:p>
+    <w:p>
+      <w:pPr>
+        <w:pStyle w:val="ListParagraph"/>
+        <w:numPr>
+          <w:ilvl w:val="0"/>
+          <w:numId w:val="2"/>
+        </w:numPr>
+        <w:spacing w:after="60"/>
+      </w:pPr>
+      <w:r>
+        <w:rPr>
+          <w:b/>
+          <w:bCs/>
+        </w:rPr>
+        <w:t xml:space="preserve">Progress:</w:t>
+      </w:r>
+      <w:r>
+        <w:t xml:space="preserve"> both apps show a progress bar while files go up or down; the lists and the map refresh when downloads land.</w:t>
+      </w:r>
+    </w:p>
+    <w:p>
+      <w:pPr>
+        <w:pStyle w:val="Heading2"/>
+      </w:pPr>
+      <w:r>
+        <w:t xml:space="preserve">PC</w:t>
+      </w:r>
+    </w:p>
+    <w:p>
+      <w:pPr>
+        <w:pStyle w:val="ListParagraph"/>
+        <w:numPr>
+          <w:ilvl w:val="0"/>
+          <w:numId w:val="2"/>
+        </w:numPr>
+        <w:spacing w:after="60"/>
+      </w:pPr>
+      <w:r>
+        <w:t xml:space="preserve">Syncs live the whole time the app is open: local changes go up within seconds, Drive changes come down within about 30 s.</w:t>
+      </w:r>
+    </w:p>
+    <w:p>
+      <w:pPr>
+        <w:pStyle w:val="ListParagraph"/>
+        <w:numPr>
+          <w:ilvl w:val="0"/>
+          <w:numId w:val="2"/>
+        </w:numPr>
+        <w:spacing w:after="60"/>
+      </w:pPr>
+      <w:r>
+        <w:t xml:space="preserve">A PC change counts only once it is on Drive. Closing the app while files are still going up asks: Wait, or Close anyway. Changes that never reached Drive are dropped on the next start (Drive overwrites them).</w:t>
+      </w:r>
+    </w:p>
+    <w:p>
+      <w:pPr>
+        <w:pStyle w:val="Heading2"/>
+      </w:pPr>
+      <w:r>
+        <w:t xml:space="preserve">Phone</w:t>
+      </w:r>
+    </w:p>
+    <w:p>
+      <w:pPr>
+        <w:pStyle w:val="ListParagraph"/>
+        <w:numPr>
+          <w:ilvl w:val="0"/>
+          <w:numId w:val="2"/>
+        </w:numPr>
+        <w:spacing w:after="60"/>
+      </w:pPr>
+      <w:r>
+        <w:rPr>
+          <w:b/>
+          <w:bCs/>
+        </w:rPr>
+        <w:t xml:space="preserve">A Sync switch on the main screen:</w:t>
+      </w:r>
+      <w:r>
+        <w:t xml:space="preserve"> when on, the phone syncs live on any network (Wi-Fi or roaming), also in the background, with a notification showing progress. When off, it sends and fetches nothing. The switch is remembered.</w:t>
+      </w:r>
+    </w:p>
+    <w:p>
+      <w:pPr>
+        <w:pStyle w:val="ListParagraph"/>
+        <w:numPr>
+          <w:ilvl w:val="0"/>
+          <w:numId w:val="2"/>
+        </w:numPr>
+        <w:spacing w:after="60"/>
+      </w:pPr>
+      <w:r>
+        <w:t xml:space="preserve">Edits made while Sync is off go up when it is turned on, file by file, unless Drive has a newer version of the same file.</w:t>
+      </w:r>
+    </w:p>
+    <w:p>
+      <w:pPr>
+        <w:pStyle w:val="Heading1"/>
+      </w:pPr>
+      <w:r>
         <w:t>Out of scope</w:t>
       </w:r>
     </w:p>
@@ -7300,19 +7508,6 @@
       </w:pPr>
       <w:r>
         <w:t>Fetching photos or descriptions for POIs.</w:t>
-      </w:r>
-    </w:p>
-    <w:p>
-      <w:pPr>
-        <w:pStyle w:val="ListParagraph"/>
-        <w:numPr>
-          <w:ilvl w:val="0"/>
-          <w:numId w:val="2"/>
-        </w:numPr>
-        <w:spacing w:after="60"/>
-      </w:pPr>
-      <w:r>
-        <w:t>Sync between phone and PC (copy files manually).</w:t>
       </w:r>
     </w:p>
     <w:p>

</xml_diff>

<commit_message>
Drive sync by the Sync button only: one pass both ways (newest wins), the Drive folder listed fresh each pass; progress with the current item, MB and time left; the last sync and what it did (click the Drive line); no close warning
Co-Authored-By: Claude Opus 5.5 <noreply@anthropic.com>
</commit_message>
<xml_diff>
--- a/docs/Trip_Explorer_Spec.docx
+++ b/docs/Trip_Explorer_Spec.docx
@@ -18,7 +18,7 @@
         <w:rPr>
           <w:color w:val="666666"/>
         </w:rPr>
-        <w:t>Sep 21, 2026 · @Someone · updated Sep 24, 2026 (Google Drive sync)</w:t>
+        <w:t>Sep 21, 2026 · @Someone · updated Sep 24, 2026 (Google Drive sync: Sync button)</w:t>
       </w:r>
     </w:p>
     <w:p>
@@ -7264,7 +7264,7 @@
     </w:p>
     <w:p>
       <w:r>
-        <w:t xml:space="preserve">Both apps keep the whole trips/ folder in sync with one folder on my Google Drive, built into the apps (no third-party sync app). I am the only user; edits never happen on both sides at the same time.</w:t>
+        <w:t xml:space="preserve">Both apps keep the whole trips/ folder in sync with one folder on my Google Drive (My Drive / Archive / General / trips), built into the apps. Nothing syncs by itself: each app has a Sync button. My routine: press Sync on the phone, wait for it to finish, then press Sync on the PC (and the other way round).</w:t>
       </w:r>
     </w:p>
     <w:p>
@@ -7281,10 +7281,10 @@
           <w:b/>
           <w:bCs/>
         </w:rPr>
-        <w:t xml:space="preserve">Drive is the truth:</w:t>
-      </w:r>
-      <w:r>
-        <w:t xml:space="preserve"> the Drive folder is the master copy. Each app keeps a full local copy (the phone in /sdcard/trips, the PC in its trips folder) and works on it as before.</w:t>
+        <w:t xml:space="preserve">A sync goes both ways:</w:t>
+      </w:r>
+      <w:r>
+        <w:t xml:space="preserve"> one press uploads what changed on this device and downloads what changed on Drive. If the same file changed on both sides, the newer change wins.</w:t>
       </w:r>
     </w:p>
     <w:p>
@@ -7304,7 +7304,7 @@
         <w:t xml:space="preserve">What is synced:</w:t>
       </w:r>
       <w:r>
-        <w:t xml:space="preserve"> everything inside trips/: trips, POI folders and media, recordings (including an unfinished recording, uploaded on every 10 s save) and plans/.</w:t>
+        <w:t xml:space="preserve"> everything inside trips/: trips, POI folders and media, recordings and plans/. The PC keeps its copy in Desktop	rips, the phone in /sdcard/trips.</w:t>
       </w:r>
     </w:p>
     <w:p>
@@ -7321,10 +7321,10 @@
           <w:b/>
           <w:bCs/>
         </w:rPr>
-        <w:t xml:space="preserve">Newest wins:</w:t>
-      </w:r>
-      <w:r>
-        <w:t xml:space="preserve"> a file changed on one side is copied to the other. If the same file changed on both sides, the newer change wins.</w:t>
+        <w:t xml:space="preserve">Renames and removals:</w:t>
+      </w:r>
+      <w:r>
+        <w:t xml:space="preserve"> a renamed or moved file or folder is renamed or moved on the other side, not sent again. A file removed on one side is removed on the other; on Drive it goes to the trash (kept 30 days), on the PC to the Recycle Bin.</w:t>
       </w:r>
     </w:p>
     <w:p>
@@ -7341,10 +7341,10 @@
           <w:b/>
           <w:bCs/>
         </w:rPr>
-        <w:t xml:space="preserve">Renames and removals:</w:t>
-      </w:r>
-      <w:r>
-        <w:t xml:space="preserve"> a file renamed or moved (a renamed POI, a stopped recording, a hidden group file) is renamed or moved on Drive, not uploaded again. A file removed on one side is removed on the other; on Drive it goes to the trash (kept 30 days).</w:t>
+        <w:t xml:space="preserve">Progress:</w:t>
+      </w:r>
+      <w:r>
+        <w:t xml:space="preserve"> while syncing, both apps show a progress bar and the item on its way, how many of how many, MB done and about how long is left. Afterwards they show when the last sync was and what it did (↑ went to Drive, ↓ came from Drive); tap the sync status (phone) or click the Drive line (PC) for the full list or an error.</w:t>
       </w:r>
     </w:p>
     <w:p>
@@ -7364,7 +7364,7 @@
         <w:t xml:space="preserve">Setup:</w:t>
       </w:r>
       <w:r>
-        <w:t xml:space="preserve"> sign in with Google once, then pick the Drive folder in the app’s own folder list. Full Drive access; the sign-in page warns once that the app is unverified (it is a personal app, not published).</w:t>
+        <w:t xml:space="preserve"> sign in with Google once, then pick the Drive folder in the app’s own folder list (full Drive access; the sign-in page warns once that the app is unverified). Picking a folder merges both sides at once.</w:t>
       </w:r>
     </w:p>
     <w:p>
@@ -7381,85 +7381,10 @@
           <w:b/>
           <w:bCs/>
         </w:rPr>
-        <w:t xml:space="preserve">Progress:</w:t>
-      </w:r>
-      <w:r>
-        <w:t xml:space="preserve"> both apps show a progress bar while files go up or down; the lists and the map refresh when downloads land.</w:t>
-      </w:r>
-    </w:p>
-    <w:p>
-      <w:pPr>
-        <w:pStyle w:val="Heading2"/>
-      </w:pPr>
-      <w:r>
-        <w:t xml:space="preserve">PC</w:t>
-      </w:r>
-    </w:p>
-    <w:p>
-      <w:pPr>
-        <w:pStyle w:val="ListParagraph"/>
-        <w:numPr>
-          <w:ilvl w:val="0"/>
-          <w:numId w:val="2"/>
-        </w:numPr>
-        <w:spacing w:after="60"/>
-      </w:pPr>
-      <w:r>
-        <w:t xml:space="preserve">Syncs live the whole time the app is open: local changes go up within seconds, Drive changes come down within about 30 s.</w:t>
-      </w:r>
-    </w:p>
-    <w:p>
-      <w:pPr>
-        <w:pStyle w:val="ListParagraph"/>
-        <w:numPr>
-          <w:ilvl w:val="0"/>
-          <w:numId w:val="2"/>
-        </w:numPr>
-        <w:spacing w:after="60"/>
-      </w:pPr>
-      <w:r>
-        <w:t xml:space="preserve">A PC change counts only once it is on Drive. Closing the app while files are still going up asks: Wait, or Close anyway. Changes that never reached Drive are dropped on the next start (Drive overwrites them).</w:t>
-      </w:r>
-    </w:p>
-    <w:p>
-      <w:pPr>
-        <w:pStyle w:val="Heading2"/>
-      </w:pPr>
-      <w:r>
-        <w:t xml:space="preserve">Phone</w:t>
-      </w:r>
-    </w:p>
-    <w:p>
-      <w:pPr>
-        <w:pStyle w:val="ListParagraph"/>
-        <w:numPr>
-          <w:ilvl w:val="0"/>
-          <w:numId w:val="2"/>
-        </w:numPr>
-        <w:spacing w:after="60"/>
-      </w:pPr>
-      <w:r>
-        <w:rPr>
-          <w:b/>
-          <w:bCs/>
-        </w:rPr>
-        <w:t xml:space="preserve">A Sync switch on the main screen:</w:t>
-      </w:r>
-      <w:r>
-        <w:t xml:space="preserve"> when on, the phone syncs live on any network (Wi-Fi or roaming), also in the background, with a notification showing progress. When off, it sends and fetches nothing. The switch is remembered.</w:t>
-      </w:r>
-    </w:p>
-    <w:p>
-      <w:pPr>
-        <w:pStyle w:val="ListParagraph"/>
-        <w:numPr>
-          <w:ilvl w:val="0"/>
-          <w:numId w:val="2"/>
-        </w:numPr>
-        <w:spacing w:after="60"/>
-      </w:pPr>
-      <w:r>
-        <w:t xml:space="preserve">Edits made while Sync is off go up when it is turned on, file by file, unless Drive has a newer version of the same file.</w:t>
+        <w:t xml:space="preserve">Phone:</w:t>
+      </w:r>
+      <w:r>
+        <w:t xml:space="preserve"> a sync started on the phone carries on if the app goes to the background (with a notification); the phone uses no data at all until Sync is pressed.</w:t>
       </w:r>
     </w:p>
     <w:p>

</xml_diff>